<commit_message>
feat: skip duplicate questions during import
</commit_message>
<xml_diff>
--- a/wwwroot/test-import-cauhoi.docx
+++ b/wwwroot/test-import-cauhoi.docx
@@ -4,15 +4,11 @@
   <w:body>
     <w:p>
       <w:r>
-        <w:t xml:space="preserve">(CLO1) Ngôn ngữ lập trình nào được sử dụng để xây dựng trang web phía client?</w:t>
-      </w:r>
-    </w:p>
-    <w:p>
-      <w:r>
-        <w:rPr>
-          <w:i w:val="false"/>
-          <w:iCs w:val="false"/>
-        </w:rPr>
+        <w:t xml:space="preserve">(CLO1) Ngôn ngữ lập trình nào được sử dụng chủ yếu để phát triển web phía client?</w:t>
+      </w:r>
+    </w:p>
+    <w:p>
+      <w:r>
         <w:t xml:space="preserve">A</w:t>
       </w:r>
       <w:r>
@@ -22,22 +18,16 @@
     <w:p>
       <w:r>
         <w:rPr>
-          <w:i w:val="false"/>
-          <w:iCs w:val="false"/>
           <w:u w:val="single"/>
         </w:rPr>
         <w:t xml:space="preserve">B</w:t>
       </w:r>
       <w:r>
-        <w:t xml:space="preserve">. HTML và JavaScript</w:t>
-      </w:r>
-    </w:p>
-    <w:p>
-      <w:r>
-        <w:rPr>
-          <w:i w:val="false"/>
-          <w:iCs w:val="false"/>
-        </w:rPr>
+        <w:t xml:space="preserve">. JavaScript</w:t>
+      </w:r>
+    </w:p>
+    <w:p>
+      <w:r>
         <w:t xml:space="preserve">C</w:t>
       </w:r>
       <w:r>
@@ -46,14 +36,10 @@
     </w:p>
     <w:p>
       <w:r>
-        <w:rPr>
-          <w:i w:val="false"/>
-          <w:iCs w:val="false"/>
-        </w:rPr>
         <w:t xml:space="preserve">D</w:t>
       </w:r>
       <w:r>
-        <w:t xml:space="preserve">. C#</w:t>
+        <w:t xml:space="preserve">. C++</w:t>
       </w:r>
     </w:p>
     <w:p>
@@ -63,14 +49,13 @@
     </w:p>
     <w:p>
       <w:r>
-        <w:t xml:space="preserve">(&lt;2&gt;)(CLO2) Cấu trúc dữ liệu nào dưới đây cho phép truy cập phần tử theo chỉ số?</w:t>
-      </w:r>
-    </w:p>
-    <w:p>
-      <w:r>
-        <w:rPr>
-          <w:i w:val="false"/>
-          <w:iCs w:val="false"/>
+        <w:t xml:space="preserve">(&lt;2&gt;)(CLO1) Cấu trúc dữ liệu nào hoạt động theo nguyên tắc LIFO?</w:t>
+      </w:r>
+    </w:p>
+    <w:p>
+      <w:r>
+        <w:rPr>
+          <w:u w:val="single"/>
         </w:rPr>
         <w:t xml:space="preserve">A</w:t>
       </w:r>
@@ -80,10 +65,6 @@
     </w:p>
     <w:p>
       <w:r>
-        <w:rPr>
-          <w:i w:val="false"/>
-          <w:iCs w:val="false"/>
-        </w:rPr>
         <w:t xml:space="preserve">B</w:t>
       </w:r>
       <w:r>
@@ -92,27 +73,63 @@
     </w:p>
     <w:p>
       <w:r>
-        <w:rPr>
-          <w:i w:val="false"/>
-          <w:iCs w:val="false"/>
+        <w:t xml:space="preserve">C</w:t>
+      </w:r>
+      <w:r>
+        <w:t xml:space="preserve">. Array</w:t>
+      </w:r>
+    </w:p>
+    <w:p>
+      <w:r>
+        <w:t xml:space="preserve">D</w:t>
+      </w:r>
+      <w:r>
+        <w:t xml:space="preserve">. Linked List</w:t>
+      </w:r>
+    </w:p>
+    <w:p>
+      <w:r>
+        <w:t xml:space="preserve">[&lt;br&gt;]</w:t>
+      </w:r>
+    </w:p>
+    <w:p>
+      <w:r>
+        <w:t xml:space="preserve">(&lt;3&gt;)(CLO2) Thuật toán sắp xếp nào có độ phức tạp trung bình O(n log n)?</w:t>
+      </w:r>
+    </w:p>
+    <w:p>
+      <w:r>
+        <w:t xml:space="preserve">A</w:t>
+      </w:r>
+      <w:r>
+        <w:t xml:space="preserve">. Bubble Sort</w:t>
+      </w:r>
+    </w:p>
+    <w:p>
+      <w:r>
+        <w:t xml:space="preserve">B</w:t>
+      </w:r>
+      <w:r>
+        <w:t xml:space="preserve">. Insertion Sort</w:t>
+      </w:r>
+    </w:p>
+    <w:p>
+      <w:r>
+        <w:rPr>
           <w:u w:val="single"/>
         </w:rPr>
         <w:t xml:space="preserve">C</w:t>
       </w:r>
       <w:r>
-        <w:t xml:space="preserve">. Array</w:t>
-      </w:r>
-    </w:p>
-    <w:p>
-      <w:r>
-        <w:rPr>
-          <w:i w:val="false"/>
-          <w:iCs w:val="false"/>
-        </w:rPr>
+        <w:t xml:space="preserve">. Quick Sort</w:t>
+      </w:r>
+    </w:p>
+    <w:p>
+      <w:r>
         <w:t xml:space="preserve">D</w:t>
       </w:r>
       <w:r>
-        <w:t xml:space="preserve">. LinkedList</w:t>
+        <w:t xml:space="preserve">. Selection Sort</w:t>
       </w:r>
     </w:p>
     <w:p>
@@ -122,56 +139,42 @@
     </w:p>
     <w:p>
       <w:r>
-        <w:t xml:space="preserve">(&lt;3&gt;)(CLO3) Độ phức tạp thời gian của thuật toán sắp xếp QuickSort trong trường hợp trung bình là?</w:t>
-      </w:r>
-    </w:p>
-    <w:p>
-      <w:r>
-        <w:rPr>
-          <w:i w:val="false"/>
-          <w:iCs w:val="false"/>
-        </w:rPr>
-        <w:t xml:space="preserve">A</w:t>
-      </w:r>
-      <w:r>
-        <w:t xml:space="preserve">. O(n2)</w:t>
-      </w:r>
-    </w:p>
-    <w:p>
-      <w:r>
-        <w:rPr>
-          <w:i w:val="false"/>
-          <w:iCs w:val="false"/>
-        </w:rPr>
+        <w:t xml:space="preserve">(CLO2) Giao thức nào được sử dụng để truyền tải trang web qua Internet?</w:t>
+      </w:r>
+    </w:p>
+    <w:p>
+      <w:r>
+        <w:t xml:space="preserve">A</w:t>
+      </w:r>
+      <w:r>
+        <w:t xml:space="preserve">. FTP</w:t>
+      </w:r>
+    </w:p>
+    <w:p>
+      <w:r>
         <w:t xml:space="preserve">B</w:t>
       </w:r>
       <w:r>
-        <w:t xml:space="preserve">. O(n)</w:t>
-      </w:r>
-    </w:p>
-    <w:p>
-      <w:r>
-        <w:rPr>
-          <w:i w:val="false"/>
-          <w:iCs w:val="false"/>
-        </w:rPr>
+        <w:t xml:space="preserve">. SMTP</w:t>
+      </w:r>
+    </w:p>
+    <w:p>
+      <w:r>
         <w:t xml:space="preserve">C</w:t>
       </w:r>
       <w:r>
-        <w:t xml:space="preserve">. O(log n)</w:t>
-      </w:r>
-    </w:p>
-    <w:p>
-      <w:r>
-        <w:rPr>
-          <w:i w:val="false"/>
-          <w:iCs w:val="false"/>
+        <w:t xml:space="preserve">. SSH</w:t>
+      </w:r>
+    </w:p>
+    <w:p>
+      <w:r>
+        <w:rPr>
           <w:u w:val="single"/>
         </w:rPr>
         <w:t xml:space="preserve">D</w:t>
       </w:r>
       <w:r>
-        <w:t xml:space="preserve">. O(n log n)</w:t>
+        <w:t xml:space="preserve">. HTTP</w:t>
       </w:r>
     </w:p>
     <w:p>
@@ -181,56 +184,120 @@
     </w:p>
     <w:p>
       <w:r>
-        <w:t xml:space="preserve">(CLO1) Giao thức nào được sử dụng để truyền trang web qua Internet?</w:t>
-      </w:r>
-    </w:p>
-    <w:p>
-      <w:r>
-        <w:rPr>
-          <w:i/>
-          <w:iCs/>
+        <w:t xml:space="preserve">(CLO1) Cau hoi khong co dap an dung - khong co chu cai nao duoc gach chan?</w:t>
+      </w:r>
+    </w:p>
+    <w:p>
+      <w:r>
+        <w:t xml:space="preserve">A</w:t>
+      </w:r>
+      <w:r>
+        <w:t xml:space="preserve">. Dap an 1</w:t>
+      </w:r>
+    </w:p>
+    <w:p>
+      <w:r>
+        <w:t xml:space="preserve">B</w:t>
+      </w:r>
+      <w:r>
+        <w:t xml:space="preserve">. Dap an 2</w:t>
+      </w:r>
+    </w:p>
+    <w:p>
+      <w:r>
+        <w:t xml:space="preserve">C</w:t>
+      </w:r>
+      <w:r>
+        <w:t xml:space="preserve">. Dap an 3</w:t>
+      </w:r>
+    </w:p>
+    <w:p>
+      <w:r>
+        <w:t xml:space="preserve">D</w:t>
+      </w:r>
+      <w:r>
+        <w:t xml:space="preserve">. Dap an 4</w:t>
+      </w:r>
+    </w:p>
+    <w:p>
+      <w:r>
+        <w:t xml:space="preserve">[&lt;br&gt;]</w:t>
+      </w:r>
+    </w:p>
+    <w:p>
+      <w:r>
+        <w:t xml:space="preserve">(CLO1) Cau hoi chi co 1 dap an?</w:t>
+      </w:r>
+    </w:p>
+    <w:p>
+      <w:r>
+        <w:rPr>
           <w:u w:val="single"/>
         </w:rPr>
         <w:t xml:space="preserve">A</w:t>
       </w:r>
       <w:r>
-        <w:t xml:space="preserve">. HTTP</w:t>
-      </w:r>
-    </w:p>
-    <w:p>
-      <w:r>
-        <w:rPr>
-          <w:i/>
-          <w:iCs/>
+        <w:t xml:space="preserve">. Dap an duy nhat</w:t>
+      </w:r>
+    </w:p>
+    <w:p>
+      <w:r>
+        <w:t xml:space="preserve">[&lt;br&gt;]</w:t>
+      </w:r>
+    </w:p>
+    <w:p>
+      <w:r>
+        <w:t xml:space="preserve">[&lt;sg&gt;]</w:t>
+      </w:r>
+    </w:p>
+    <w:p>
+      <w:r>
+        <w:t xml:space="preserve">Doc doan van sau va tra loi cac cau {&lt;1&gt;} – {&lt;3&gt;}: Python la ngon ngu lap trinh bac cao, duoc thiet ke voi triet ly nhan manh kha nang doc code. Ngon ngu nay duoc Guido van Rossum tao ra nam 1991.</w:t>
+      </w:r>
+    </w:p>
+    <w:p>
+      <w:r>
+        <w:t xml:space="preserve">[&lt;egc&gt;]</w:t>
+      </w:r>
+    </w:p>
+    <w:p>
+      <w:r>
+        <w:t xml:space="preserve">(&lt;1&gt;)(CLO3) Python duoc tao ra boi ai?</w:t>
+      </w:r>
+    </w:p>
+    <w:p>
+      <w:r>
+        <w:t xml:space="preserve">A</w:t>
+      </w:r>
+      <w:r>
+        <w:t xml:space="preserve">. Dennis Ritchie</w:t>
+      </w:r>
+    </w:p>
+    <w:p>
+      <w:r>
+        <w:rPr>
+          <w:u w:val="single"/>
         </w:rPr>
         <w:t xml:space="preserve">B</w:t>
       </w:r>
       <w:r>
-        <w:t xml:space="preserve">. FTP</w:t>
-      </w:r>
-    </w:p>
-    <w:p>
-      <w:r>
-        <w:rPr>
-          <w:i w:val="false"/>
-          <w:iCs w:val="false"/>
-        </w:rPr>
+        <w:t xml:space="preserve">. Guido van Rossum</w:t>
+      </w:r>
+    </w:p>
+    <w:p>
+      <w:r>
         <w:t xml:space="preserve">C</w:t>
       </w:r>
       <w:r>
-        <w:t xml:space="preserve">. SMTP</w:t>
-      </w:r>
-    </w:p>
-    <w:p>
-      <w:r>
-        <w:rPr>
-          <w:i w:val="false"/>
-          <w:iCs w:val="false"/>
-        </w:rPr>
+        <w:t xml:space="preserve">. James Gosling</w:t>
+      </w:r>
+    </w:p>
+    <w:p>
+      <w:r>
         <w:t xml:space="preserve">D</w:t>
       </w:r>
       <w:r>
-        <w:t xml:space="preserve">. POP3</w:t>
+        <w:t xml:space="preserve">. Bjarne Stroustrup</w:t>
       </w:r>
     </w:p>
     <w:p>
@@ -240,56 +307,87 @@
     </w:p>
     <w:p>
       <w:r>
-        <w:t xml:space="preserve">(CLO2) Design pattern nào thuộc nhóm Creational?</w:t>
-      </w:r>
-    </w:p>
-    <w:p>
-      <w:r>
-        <w:rPr>
-          <w:i w:val="false"/>
-          <w:iCs w:val="false"/>
-        </w:rPr>
-        <w:t xml:space="preserve">A</w:t>
-      </w:r>
-      <w:r>
-        <w:t xml:space="preserve">. Observer</w:t>
-      </w:r>
-    </w:p>
-    <w:p>
-      <w:r>
-        <w:rPr>
-          <w:i w:val="false"/>
-          <w:iCs w:val="false"/>
-        </w:rPr>
+        <w:t xml:space="preserve">(&lt;2&gt;)(CLO3) Ham nao dung de hien thi ket qua ra man hinh trong Python?</w:t>
+      </w:r>
+    </w:p>
+    <w:p>
+      <w:r>
+        <w:rPr>
+          <w:u w:val="single"/>
+        </w:rPr>
+        <w:t xml:space="preserve">A</w:t>
+      </w:r>
+      <w:r>
+        <w:t xml:space="preserve">. print()</w:t>
+      </w:r>
+    </w:p>
+    <w:p>
+      <w:r>
         <w:t xml:space="preserve">B</w:t>
       </w:r>
       <w:r>
-        <w:t xml:space="preserve">. Strategy</w:t>
-      </w:r>
-    </w:p>
-    <w:p>
-      <w:r>
-        <w:rPr>
-          <w:i w:val="false"/>
-          <w:iCs w:val="false"/>
+        <w:t xml:space="preserve">. echo()</w:t>
+      </w:r>
+    </w:p>
+    <w:p>
+      <w:r>
+        <w:t xml:space="preserve">C</w:t>
+      </w:r>
+      <w:r>
+        <w:t xml:space="preserve">. console.log()</w:t>
+      </w:r>
+    </w:p>
+    <w:p>
+      <w:r>
+        <w:t xml:space="preserve">D</w:t>
+      </w:r>
+      <w:r>
+        <w:t xml:space="preserve">. display()</w:t>
+      </w:r>
+    </w:p>
+    <w:p>
+      <w:r>
+        <w:t xml:space="preserve">[&lt;br&gt;]</w:t>
+      </w:r>
+    </w:p>
+    <w:p>
+      <w:r>
+        <w:t xml:space="preserve">(&lt;3&gt;)(CLO3) Kieu du lieu nao KHONG ton tai trong Python?</w:t>
+      </w:r>
+    </w:p>
+    <w:p>
+      <w:r>
+        <w:t xml:space="preserve">A</w:t>
+      </w:r>
+      <w:r>
+        <w:t xml:space="preserve">. list</w:t>
+      </w:r>
+    </w:p>
+    <w:p>
+      <w:r>
+        <w:t xml:space="preserve">B</w:t>
+      </w:r>
+      <w:r>
+        <w:t xml:space="preserve">. tuple</w:t>
+      </w:r>
+    </w:p>
+    <w:p>
+      <w:r>
+        <w:rPr>
           <w:u w:val="single"/>
         </w:rPr>
         <w:t xml:space="preserve">C</w:t>
       </w:r>
       <w:r>
-        <w:t xml:space="preserve">. Singleton</w:t>
-      </w:r>
-    </w:p>
-    <w:p>
-      <w:r>
-        <w:rPr>
-          <w:i w:val="false"/>
-          <w:iCs w:val="false"/>
-        </w:rPr>
+        <w:t xml:space="preserve">. char</w:t>
+      </w:r>
+    </w:p>
+    <w:p>
+      <w:r>
         <w:t xml:space="preserve">D</w:t>
       </w:r>
       <w:r>
-        <w:t xml:space="preserve">. Decorator</w:t>
+        <w:t xml:space="preserve">. dict</w:t>
       </w:r>
     </w:p>
     <w:p>
@@ -299,15 +397,16 @@
     </w:p>
     <w:p>
       <w:r>
-        <w:t xml:space="preserve">(CLO1) Cau hoi khong co dap an dung - khong co chu cai nao duoc gach chan?</w:t>
-      </w:r>
-    </w:p>
-    <w:p>
-      <w:r>
-        <w:rPr>
-          <w:i w:val="false"/>
-          <w:iCs w:val="false"/>
-        </w:rPr>
+        <w:t xml:space="preserve">[&lt;/sg&gt;]</w:t>
+      </w:r>
+    </w:p>
+    <w:p>
+      <w:r>
+        <w:t xml:space="preserve">(CLO1) Cau hoi cuoi file khong co dau ket thuc?</w:t>
+      </w:r>
+    </w:p>
+    <w:p>
+      <w:r>
         <w:t xml:space="preserve">A</w:t>
       </w:r>
       <w:r>
@@ -317,8 +416,7 @@
     <w:p>
       <w:r>
         <w:rPr>
-          <w:i w:val="false"/>
-          <w:iCs w:val="false"/>
+          <w:u w:val="single"/>
         </w:rPr>
         <w:t xml:space="preserve">B</w:t>
       </w:r>
@@ -328,10 +426,6 @@
     </w:p>
     <w:p>
       <w:r>
-        <w:rPr>
-          <w:i w:val="false"/>
-          <w:iCs w:val="false"/>
-        </w:rPr>
         <w:t xml:space="preserve">C</w:t>
       </w:r>
       <w:r>
@@ -340,92 +434,6 @@
     </w:p>
     <w:p>
       <w:r>
-        <w:rPr>
-          <w:i w:val="false"/>
-          <w:iCs w:val="false"/>
-        </w:rPr>
-        <w:t xml:space="preserve">D</w:t>
-      </w:r>
-      <w:r>
-        <w:t xml:space="preserve">. Dap an D</w:t>
-      </w:r>
-    </w:p>
-    <w:p>
-      <w:r>
-        <w:t xml:space="preserve">[&lt;br&gt;]</w:t>
-      </w:r>
-    </w:p>
-    <w:p>
-      <w:r>
-        <w:t xml:space="preserve">(CLO1) Cau hoi chi co 1 dap an?</w:t>
-      </w:r>
-    </w:p>
-    <w:p>
-      <w:r>
-        <w:rPr>
-          <w:i w:val="false"/>
-          <w:iCs w:val="false"/>
-          <w:u w:val="single"/>
-        </w:rPr>
-        <w:t xml:space="preserve">A</w:t>
-      </w:r>
-      <w:r>
-        <w:t xml:space="preserve">. Chi co mot dap an nay</w:t>
-      </w:r>
-    </w:p>
-    <w:p>
-      <w:r>
-        <w:t xml:space="preserve">[&lt;br&gt;]</w:t>
-      </w:r>
-    </w:p>
-    <w:p>
-      <w:r>
-        <w:t xml:space="preserve">(&lt;2&gt;)(CLO3) Cau hoi cuoi file khong co dau ket thuc?</w:t>
-      </w:r>
-    </w:p>
-    <w:p>
-      <w:r>
-        <w:rPr>
-          <w:i w:val="false"/>
-          <w:iCs w:val="false"/>
-        </w:rPr>
-        <w:t xml:space="preserve">A</w:t>
-      </w:r>
-      <w:r>
-        <w:t xml:space="preserve">. Dap an A</w:t>
-      </w:r>
-    </w:p>
-    <w:p>
-      <w:r>
-        <w:rPr>
-          <w:i w:val="false"/>
-          <w:iCs w:val="false"/>
-          <w:u w:val="single"/>
-        </w:rPr>
-        <w:t xml:space="preserve">B</w:t>
-      </w:r>
-      <w:r>
-        <w:t xml:space="preserve">. Dap an B</w:t>
-      </w:r>
-    </w:p>
-    <w:p>
-      <w:r>
-        <w:rPr>
-          <w:i w:val="false"/>
-          <w:iCs w:val="false"/>
-        </w:rPr>
-        <w:t xml:space="preserve">C</w:t>
-      </w:r>
-      <w:r>
-        <w:t xml:space="preserve">. Dap an C</w:t>
-      </w:r>
-    </w:p>
-    <w:p>
-      <w:r>
-        <w:rPr>
-          <w:i w:val="false"/>
-          <w:iCs w:val="false"/>
-        </w:rPr>
         <w:t xml:space="preserve">D</w:t>
       </w:r>
       <w:r>

</xml_diff>